<commit_message>
Standardize trailing periods in HiTOP-SR/BR item text
7 of 405 hitopsr_items and 1 of 45 hitopbr_items Text entries lacked a
trailing period (HSR 5, 27, 30, 284, 314, 332, 382; HBR 41). The source
export (devel/hitopsr_titanium.xml) has the same omissions (398/405 end
in a period), so these are treated as typographical oversights in the
source; wording is otherwise verbatim and no keying content changed.
Approved by Jeff 2026-07-16 (see SOURCES.md note).

Regenerated: data/hitopsr_{items,scales,subscales}.rda,
data/hitopbr_{items,scales}.rda, and the 8 prebuilt SR/BR artifacts in
inst/extdata/ (DOCX US/A4, Qualtrics txt, REDCap zip; txt artifacts
normalize CRLF->LF per writeLines() on macOS).

Test suite: FAIL 0 | SKIP 1 | PASS 615.

Co-Authored-By: Claude Opus 4.8 <noreply@anthropic.com>
</commit_message>
<xml_diff>
--- a/inst/extdata/hitopbr_1.0_A4.docx
+++ b/inst/extdata/hitopbr_1.0_A4.docx
@@ -11359,7 +11359,7 @@
                 <w:szCs w:val="20"/>
                 <w:color w:val="000000"/>
               </w:rPr>
-              <w:t xml:space="preserve">41.  I was afraid that I might suffer from a serious illness</w:t>
+              <w:t xml:space="preserve">41.  I was afraid that I might suffer from a serious illness.</w:t>
             </w:r>
           </w:p>
         </w:tc>
@@ -13008,7 +13008,7 @@
               <w:left w:w="0" w:type="dxa"/>
               <w:right w:w="0" w:type="dxa"/>
             </w:tcMar>
-            <w:vAlign w:val="center"/>
+            <w:vAlign w:val="top"/>
           </w:tcPr>
           <w:p>
             <w:pPr>
@@ -13063,7 +13063,7 @@
               <w:left w:w="0" w:type="dxa"/>
               <w:right w:w="0" w:type="dxa"/>
             </w:tcMar>
-            <w:vAlign w:val="center"/>
+            <w:vAlign w:val="top"/>
           </w:tcPr>
           <w:p>
             <w:pPr>
@@ -13118,7 +13118,7 @@
               <w:left w:w="0" w:type="dxa"/>
               <w:right w:w="0" w:type="dxa"/>
             </w:tcMar>
-            <w:vAlign w:val="center"/>
+            <w:vAlign w:val="top"/>
           </w:tcPr>
           <w:p>
             <w:pPr>
@@ -13173,7 +13173,7 @@
               <w:left w:w="0" w:type="dxa"/>
               <w:right w:w="0" w:type="dxa"/>
             </w:tcMar>
-            <w:vAlign w:val="center"/>
+            <w:vAlign w:val="top"/>
           </w:tcPr>
           <w:p>
             <w:pPr>
@@ -13233,7 +13233,7 @@
               <w:left w:w="0" w:type="dxa"/>
               <w:right w:w="0" w:type="dxa"/>
             </w:tcMar>
-            <w:vAlign w:val="center"/>
+            <w:vAlign w:val="top"/>
           </w:tcPr>
           <w:p>
             <w:pPr>
@@ -13288,7 +13288,7 @@
               <w:left w:w="0" w:type="dxa"/>
               <w:right w:w="0" w:type="dxa"/>
             </w:tcMar>
-            <w:vAlign w:val="center"/>
+            <w:vAlign w:val="top"/>
           </w:tcPr>
           <w:p>
             <w:pPr>
@@ -13343,7 +13343,7 @@
               <w:left w:w="0" w:type="dxa"/>
               <w:right w:w="0" w:type="dxa"/>
             </w:tcMar>
-            <w:vAlign w:val="center"/>
+            <w:vAlign w:val="top"/>
           </w:tcPr>
           <w:p>
             <w:pPr>
@@ -13398,7 +13398,7 @@
               <w:left w:w="0" w:type="dxa"/>
               <w:right w:w="0" w:type="dxa"/>
             </w:tcMar>
-            <w:vAlign w:val="center"/>
+            <w:vAlign w:val="top"/>
           </w:tcPr>
           <w:p>
             <w:pPr>
@@ -13458,7 +13458,7 @@
               <w:left w:w="0" w:type="dxa"/>
               <w:right w:w="0" w:type="dxa"/>
             </w:tcMar>
-            <w:vAlign w:val="center"/>
+            <w:vAlign w:val="top"/>
           </w:tcPr>
           <w:p>
             <w:pPr>
@@ -13513,7 +13513,7 @@
               <w:left w:w="0" w:type="dxa"/>
               <w:right w:w="0" w:type="dxa"/>
             </w:tcMar>
-            <w:vAlign w:val="center"/>
+            <w:vAlign w:val="top"/>
           </w:tcPr>
           <w:p>
             <w:pPr>
@@ -13568,7 +13568,7 @@
               <w:left w:w="0" w:type="dxa"/>
               <w:right w:w="0" w:type="dxa"/>
             </w:tcMar>
-            <w:vAlign w:val="center"/>
+            <w:vAlign w:val="top"/>
           </w:tcPr>
           <w:p>
             <w:pPr>
@@ -13623,7 +13623,7 @@
               <w:left w:w="0" w:type="dxa"/>
               <w:right w:w="0" w:type="dxa"/>
             </w:tcMar>
-            <w:vAlign w:val="center"/>
+            <w:vAlign w:val="top"/>
           </w:tcPr>
           <w:p>
             <w:pPr>
@@ -13683,7 +13683,7 @@
               <w:left w:w="0" w:type="dxa"/>
               <w:right w:w="0" w:type="dxa"/>
             </w:tcMar>
-            <w:vAlign w:val="center"/>
+            <w:vAlign w:val="top"/>
           </w:tcPr>
           <w:p>
             <w:pPr>
@@ -13738,7 +13738,7 @@
               <w:left w:w="0" w:type="dxa"/>
               <w:right w:w="0" w:type="dxa"/>
             </w:tcMar>
-            <w:vAlign w:val="center"/>
+            <w:vAlign w:val="top"/>
           </w:tcPr>
           <w:p>
             <w:pPr>
@@ -13793,7 +13793,7 @@
               <w:left w:w="0" w:type="dxa"/>
               <w:right w:w="0" w:type="dxa"/>
             </w:tcMar>
-            <w:vAlign w:val="center"/>
+            <w:vAlign w:val="top"/>
           </w:tcPr>
           <w:p>
             <w:pPr>
@@ -13848,7 +13848,7 @@
               <w:left w:w="0" w:type="dxa"/>
               <w:right w:w="0" w:type="dxa"/>
             </w:tcMar>
-            <w:vAlign w:val="center"/>
+            <w:vAlign w:val="top"/>
           </w:tcPr>
           <w:p>
             <w:pPr>

</xml_diff>